<commit_message>
Project part 1,2 and 3
</commit_message>
<xml_diff>
--- a/project_1/rapport_projet.docx
+++ b/project_1/rapport_projet.docx
@@ -210,96 +210,6 @@
     </w:p>
     <w:p>
       <w:pPr>
-        <w:rPr>
-          <w:rStyle w:val="SubtleEmphasis"/>
-          <w:i w:val="0"/>
-          <w:iCs w:val="0"/>
-          <w:lang w:val="fr-CA"/>
-        </w:rPr>
-      </w:pPr>
-    </w:p>
-    <w:p>
-      <w:pPr>
-        <w:rPr>
-          <w:rStyle w:val="SubtleEmphasis"/>
-          <w:i w:val="0"/>
-          <w:iCs w:val="0"/>
-          <w:lang w:val="fr-CA"/>
-        </w:rPr>
-      </w:pPr>
-    </w:p>
-    <w:p>
-      <w:pPr>
-        <w:rPr>
-          <w:rStyle w:val="SubtleEmphasis"/>
-          <w:i w:val="0"/>
-          <w:iCs w:val="0"/>
-          <w:lang w:val="fr-CA"/>
-        </w:rPr>
-      </w:pPr>
-    </w:p>
-    <w:p>
-      <w:pPr>
-        <w:rPr>
-          <w:rStyle w:val="SubtleEmphasis"/>
-          <w:i w:val="0"/>
-          <w:iCs w:val="0"/>
-          <w:lang w:val="fr-CA"/>
-        </w:rPr>
-      </w:pPr>
-    </w:p>
-    <w:p>
-      <w:pPr>
-        <w:rPr>
-          <w:rStyle w:val="SubtleEmphasis"/>
-          <w:i w:val="0"/>
-          <w:iCs w:val="0"/>
-          <w:lang w:val="fr-CA"/>
-        </w:rPr>
-      </w:pPr>
-    </w:p>
-    <w:p>
-      <w:pPr>
-        <w:rPr>
-          <w:rStyle w:val="SubtleEmphasis"/>
-          <w:i w:val="0"/>
-          <w:iCs w:val="0"/>
-          <w:lang w:val="fr-CA"/>
-        </w:rPr>
-      </w:pPr>
-    </w:p>
-    <w:p>
-      <w:pPr>
-        <w:rPr>
-          <w:rStyle w:val="SubtleEmphasis"/>
-          <w:i w:val="0"/>
-          <w:iCs w:val="0"/>
-          <w:lang w:val="fr-CA"/>
-        </w:rPr>
-      </w:pPr>
-    </w:p>
-    <w:p>
-      <w:pPr>
-        <w:rPr>
-          <w:rStyle w:val="SubtleEmphasis"/>
-          <w:i w:val="0"/>
-          <w:iCs w:val="0"/>
-          <w:lang w:val="fr-CA"/>
-        </w:rPr>
-      </w:pPr>
-    </w:p>
-    <w:p>
-      <w:pPr>
-        <w:rPr>
-          <w:rStyle w:val="SubtleEmphasis"/>
-          <w:i w:val="0"/>
-          <w:iCs w:val="0"/>
-          <w:lang w:val="fr-CA"/>
-        </w:rPr>
-      </w:pPr>
-    </w:p>
-    <w:p>
-      <w:pPr>
         <w:pStyle w:val="Subtitle"/>
         <w:rPr>
           <w:lang w:val="fr-CA"/>
@@ -315,6 +225,117 @@
         <w:rPr>
           <w:lang w:val="fr-CA"/>
         </w:rPr>
+        <w:t>2</w:t>
+      </w:r>
+    </w:p>
+    <w:p>
+      <w:pPr>
+        <w:rPr>
+          <w:rStyle w:val="SubtleEmphasis"/>
+          <w:lang w:val="fr-CA"/>
+        </w:rPr>
+      </w:pPr>
+      <w:r>
+        <w:rPr>
+          <w:rStyle w:val="SubtleEmphasis"/>
+          <w:lang w:val="fr-CA"/>
+        </w:rPr>
+        <w:t xml:space="preserve">Photo de votre PCB </w:t>
+      </w:r>
+      <w:r>
+        <w:rPr>
+          <w:rStyle w:val="SubtleEmphasis"/>
+          <w:lang w:val="fr-CA"/>
+        </w:rPr>
+        <w:t>soudé en Surface-Mount</w:t>
+      </w:r>
+      <w:r>
+        <w:rPr>
+          <w:rStyle w:val="SubtleEmphasis"/>
+          <w:lang w:val="fr-CA"/>
+        </w:rPr>
+        <w:t> :</w:t>
+      </w:r>
+    </w:p>
+    <w:p>
+      <w:pPr>
+        <w:rPr>
+          <w:rStyle w:val="SubtleEmphasis"/>
+          <w:lang w:val="fr-CA"/>
+        </w:rPr>
+      </w:pPr>
+      <w:r>
+        <w:rPr>
+          <w:rStyle w:val="SubtleEmphasis"/>
+          <w:lang w:val="fr-CA"/>
+        </w:rPr>
+        <w:t>.</w:t>
+      </w:r>
+    </w:p>
+    <w:p>
+      <w:pPr>
+        <w:rPr>
+          <w:rStyle w:val="SubtleEmphasis"/>
+          <w:lang w:val="fr-CA"/>
+        </w:rPr>
+      </w:pPr>
+      <w:r>
+        <w:rPr>
+          <w:rStyle w:val="SubtleEmphasis"/>
+          <w:lang w:val="fr-CA"/>
+        </w:rPr>
+        <w:t>.</w:t>
+      </w:r>
+    </w:p>
+    <w:p>
+      <w:pPr>
+        <w:rPr>
+          <w:rStyle w:val="SubtleEmphasis"/>
+          <w:lang w:val="fr-CA"/>
+        </w:rPr>
+      </w:pPr>
+      <w:r>
+        <w:rPr>
+          <w:rStyle w:val="SubtleEmphasis"/>
+          <w:lang w:val="fr-CA"/>
+        </w:rPr>
+        <w:t>.</w:t>
+      </w:r>
+    </w:p>
+    <w:p>
+      <w:pPr>
+        <w:rPr>
+          <w:rStyle w:val="SubtleEmphasis"/>
+          <w:i w:val="0"/>
+          <w:iCs w:val="0"/>
+          <w:lang w:val="fr-CA"/>
+        </w:rPr>
+      </w:pPr>
+      <w:r>
+        <w:rPr>
+          <w:rStyle w:val="SubtleEmphasis"/>
+          <w:lang w:val="fr-CA"/>
+        </w:rPr>
+        <w:t>.</w:t>
+      </w:r>
+    </w:p>
+    <w:p>
+      <w:pPr>
+        <w:pStyle w:val="Subtitle"/>
+        <w:rPr>
+          <w:lang w:val="fr-CA"/>
+        </w:rPr>
+      </w:pPr>
+      <w:r>
+        <w:rPr>
+          <w:lang w:val="fr-CA"/>
+        </w:rPr>
+        <w:t xml:space="preserve">Partie </w:t>
+      </w:r>
+      <w:r>
+        <w:rPr>
+          <w:lang w:val="fr-CA"/>
+        </w:rPr>
         <w:t>3</w:t>
       </w:r>
     </w:p>
@@ -330,6 +351,434 @@
           <w:rStyle w:val="SubtleEmphasis"/>
           <w:lang w:val="fr-CA"/>
         </w:rPr>
+        <w:t xml:space="preserve">Programmer le code de ‘UART Testing’ et valider que votre data fonctionne avec le port COM sur l’Arduino IDE, prendre une capture de la trame sur </w:t>
+      </w:r>
+      <w:proofErr w:type="spellStart"/>
+      <w:r>
+        <w:rPr>
+          <w:rStyle w:val="SubtleEmphasis"/>
+          <w:lang w:val="fr-CA"/>
+        </w:rPr>
+        <w:t>Rx</w:t>
+      </w:r>
+      <w:proofErr w:type="spellEnd"/>
+      <w:r>
+        <w:rPr>
+          <w:rStyle w:val="SubtleEmphasis"/>
+          <w:lang w:val="fr-CA"/>
+        </w:rPr>
+        <w:t xml:space="preserve"> et </w:t>
+      </w:r>
+      <w:proofErr w:type="spellStart"/>
+      <w:r>
+        <w:rPr>
+          <w:rStyle w:val="SubtleEmphasis"/>
+          <w:lang w:val="fr-CA"/>
+        </w:rPr>
+        <w:t>Tx</w:t>
+      </w:r>
+      <w:proofErr w:type="spellEnd"/>
+    </w:p>
+    <w:p>
+      <w:pPr>
+        <w:rPr>
+          <w:rStyle w:val="SubtleEmphasis"/>
+          <w:lang w:val="fr-CA"/>
+        </w:rPr>
+      </w:pPr>
+      <w:r>
+        <w:rPr>
+          <w:rStyle w:val="SubtleEmphasis"/>
+          <w:lang w:val="fr-CA"/>
+        </w:rPr>
+        <w:t>.</w:t>
+      </w:r>
+    </w:p>
+    <w:p>
+      <w:pPr>
+        <w:rPr>
+          <w:rStyle w:val="SubtleEmphasis"/>
+          <w:lang w:val="fr-CA"/>
+        </w:rPr>
+      </w:pPr>
+      <w:r>
+        <w:rPr>
+          <w:rStyle w:val="SubtleEmphasis"/>
+          <w:lang w:val="fr-CA"/>
+        </w:rPr>
+        <w:t>.</w:t>
+      </w:r>
+    </w:p>
+    <w:p>
+      <w:pPr>
+        <w:rPr>
+          <w:rStyle w:val="SubtleEmphasis"/>
+          <w:lang w:val="fr-CA"/>
+        </w:rPr>
+      </w:pPr>
+      <w:r>
+        <w:rPr>
+          <w:rStyle w:val="SubtleEmphasis"/>
+          <w:lang w:val="fr-CA"/>
+        </w:rPr>
+        <w:t>.</w:t>
+      </w:r>
+    </w:p>
+    <w:p>
+      <w:pPr>
+        <w:rPr>
+          <w:rStyle w:val="SubtleEmphasis"/>
+          <w:lang w:val="fr-CA"/>
+        </w:rPr>
+      </w:pPr>
+      <w:r>
+        <w:rPr>
+          <w:rStyle w:val="SubtleEmphasis"/>
+          <w:lang w:val="fr-CA"/>
+        </w:rPr>
+        <w:t>.</w:t>
+      </w:r>
+    </w:p>
+    <w:p>
+      <w:pPr>
+        <w:rPr>
+          <w:rStyle w:val="SubtleEmphasis"/>
+          <w:lang w:val="fr-CA"/>
+        </w:rPr>
+      </w:pPr>
+    </w:p>
+    <w:p>
+      <w:pPr>
+        <w:rPr>
+          <w:rStyle w:val="SubtleEmphasis"/>
+          <w:i w:val="0"/>
+          <w:iCs w:val="0"/>
+          <w:lang w:val="fr-CA"/>
+        </w:rPr>
+      </w:pPr>
+    </w:p>
+    <w:p>
+      <w:pPr>
+        <w:rPr>
+          <w:rStyle w:val="SubtleEmphasis"/>
+          <w:lang w:val="fr-CA"/>
+        </w:rPr>
+      </w:pPr>
+      <w:r>
+        <w:rPr>
+          <w:rStyle w:val="SubtleEmphasis"/>
+          <w:lang w:val="fr-CA"/>
+        </w:rPr>
+        <w:lastRenderedPageBreak/>
+        <w:t>Programmer le code de ‘</w:t>
+      </w:r>
+      <w:r>
+        <w:rPr>
+          <w:rStyle w:val="SubtleEmphasis"/>
+          <w:lang w:val="fr-CA"/>
+        </w:rPr>
+        <w:t xml:space="preserve">Blink’ </w:t>
+      </w:r>
+      <w:r>
+        <w:rPr>
+          <w:rStyle w:val="SubtleEmphasis"/>
+          <w:lang w:val="fr-CA"/>
+        </w:rPr>
+        <w:t xml:space="preserve">et valider que </w:t>
+      </w:r>
+      <w:r>
+        <w:rPr>
+          <w:rStyle w:val="SubtleEmphasis"/>
+          <w:lang w:val="fr-CA"/>
+        </w:rPr>
+        <w:t>pin D13 oscille à la fréquence indiquer. Faire une prise d’oscilloscope sur la pin D13</w:t>
+      </w:r>
+    </w:p>
+    <w:p>
+      <w:pPr>
+        <w:rPr>
+          <w:rStyle w:val="SubtleEmphasis"/>
+          <w:lang w:val="fr-CA"/>
+        </w:rPr>
+      </w:pPr>
+      <w:r>
+        <w:rPr>
+          <w:rStyle w:val="SubtleEmphasis"/>
+          <w:lang w:val="fr-CA"/>
+        </w:rPr>
+        <w:t>.</w:t>
+      </w:r>
+    </w:p>
+    <w:p>
+      <w:pPr>
+        <w:rPr>
+          <w:rStyle w:val="SubtleEmphasis"/>
+          <w:lang w:val="fr-CA"/>
+        </w:rPr>
+      </w:pPr>
+      <w:r>
+        <w:rPr>
+          <w:rStyle w:val="SubtleEmphasis"/>
+          <w:lang w:val="fr-CA"/>
+        </w:rPr>
+        <w:t>.</w:t>
+      </w:r>
+    </w:p>
+    <w:p>
+      <w:pPr>
+        <w:rPr>
+          <w:rStyle w:val="SubtleEmphasis"/>
+          <w:lang w:val="fr-CA"/>
+        </w:rPr>
+      </w:pPr>
+      <w:r>
+        <w:rPr>
+          <w:rStyle w:val="SubtleEmphasis"/>
+          <w:lang w:val="fr-CA"/>
+        </w:rPr>
+        <w:t>.</w:t>
+      </w:r>
+    </w:p>
+    <w:p>
+      <w:pPr>
+        <w:rPr>
+          <w:rStyle w:val="SubtleEmphasis"/>
+          <w:lang w:val="fr-CA"/>
+        </w:rPr>
+      </w:pPr>
+      <w:r>
+        <w:rPr>
+          <w:rStyle w:val="SubtleEmphasis"/>
+          <w:lang w:val="fr-CA"/>
+        </w:rPr>
+        <w:t>.</w:t>
+      </w:r>
+    </w:p>
+    <w:p>
+      <w:pPr>
+        <w:rPr>
+          <w:rStyle w:val="SubtleEmphasis"/>
+          <w:lang w:val="fr-CA"/>
+        </w:rPr>
+      </w:pPr>
+    </w:p>
+    <w:p>
+      <w:pPr>
+        <w:rPr>
+          <w:rStyle w:val="SubtleEmphasis"/>
+          <w:lang w:val="fr-CA"/>
+        </w:rPr>
+      </w:pPr>
+      <w:r>
+        <w:rPr>
+          <w:rStyle w:val="SubtleEmphasis"/>
+          <w:lang w:val="fr-CA"/>
+        </w:rPr>
+        <w:t>À l’aide des branchements et du code de ‘SD Card testing’, brancher le lecteur de carte SD et lancer le programme de détection. Écrire ici la sortie du port série dans l’IDE d’Arduino. Le tout doit détecter la carte et y sortir les fichiers à l’intérieur.</w:t>
+      </w:r>
+    </w:p>
+    <w:p>
+      <w:pPr>
+        <w:rPr>
+          <w:rStyle w:val="SubtleEmphasis"/>
+          <w:lang w:val="fr-CA"/>
+        </w:rPr>
+      </w:pPr>
+      <w:r>
+        <w:rPr>
+          <w:rStyle w:val="SubtleEmphasis"/>
+          <w:lang w:val="fr-CA"/>
+        </w:rPr>
+        <w:t>.</w:t>
+      </w:r>
+    </w:p>
+    <w:p>
+      <w:pPr>
+        <w:rPr>
+          <w:rStyle w:val="SubtleEmphasis"/>
+          <w:lang w:val="fr-CA"/>
+        </w:rPr>
+      </w:pPr>
+      <w:r>
+        <w:rPr>
+          <w:rStyle w:val="SubtleEmphasis"/>
+          <w:lang w:val="fr-CA"/>
+        </w:rPr>
+        <w:t>.</w:t>
+      </w:r>
+    </w:p>
+    <w:p>
+      <w:pPr>
+        <w:rPr>
+          <w:rStyle w:val="SubtleEmphasis"/>
+          <w:lang w:val="fr-CA"/>
+        </w:rPr>
+      </w:pPr>
+      <w:r>
+        <w:rPr>
+          <w:rStyle w:val="SubtleEmphasis"/>
+          <w:lang w:val="fr-CA"/>
+        </w:rPr>
+        <w:t>.</w:t>
+      </w:r>
+    </w:p>
+    <w:p>
+      <w:pPr>
+        <w:rPr>
+          <w:rStyle w:val="SubtleEmphasis"/>
+          <w:lang w:val="fr-CA"/>
+        </w:rPr>
+      </w:pPr>
+      <w:r>
+        <w:rPr>
+          <w:rStyle w:val="SubtleEmphasis"/>
+          <w:lang w:val="fr-CA"/>
+        </w:rPr>
+        <w:t>.</w:t>
+      </w:r>
+    </w:p>
+    <w:p>
+      <w:pPr>
+        <w:rPr>
+          <w:rStyle w:val="SubtleEmphasis"/>
+          <w:i w:val="0"/>
+          <w:iCs w:val="0"/>
+          <w:lang w:val="fr-CA"/>
+        </w:rPr>
+      </w:pPr>
+    </w:p>
+    <w:p>
+      <w:pPr>
+        <w:rPr>
+          <w:rStyle w:val="SubtleEmphasis"/>
+          <w:i w:val="0"/>
+          <w:iCs w:val="0"/>
+          <w:lang w:val="fr-CA"/>
+        </w:rPr>
+      </w:pPr>
+    </w:p>
+    <w:p>
+      <w:pPr>
+        <w:rPr>
+          <w:rStyle w:val="SubtleEmphasis"/>
+          <w:i w:val="0"/>
+          <w:iCs w:val="0"/>
+          <w:lang w:val="fr-CA"/>
+        </w:rPr>
+      </w:pPr>
+    </w:p>
+    <w:p>
+      <w:pPr>
+        <w:rPr>
+          <w:rStyle w:val="SubtleEmphasis"/>
+          <w:i w:val="0"/>
+          <w:iCs w:val="0"/>
+          <w:lang w:val="fr-CA"/>
+        </w:rPr>
+      </w:pPr>
+    </w:p>
+    <w:p>
+      <w:pPr>
+        <w:rPr>
+          <w:rStyle w:val="SubtleEmphasis"/>
+          <w:i w:val="0"/>
+          <w:iCs w:val="0"/>
+          <w:lang w:val="fr-CA"/>
+        </w:rPr>
+      </w:pPr>
+    </w:p>
+    <w:p>
+      <w:pPr>
+        <w:rPr>
+          <w:rStyle w:val="SubtleEmphasis"/>
+          <w:i w:val="0"/>
+          <w:iCs w:val="0"/>
+          <w:lang w:val="fr-CA"/>
+        </w:rPr>
+      </w:pPr>
+    </w:p>
+    <w:p>
+      <w:pPr>
+        <w:rPr>
+          <w:rStyle w:val="SubtleEmphasis"/>
+          <w:i w:val="0"/>
+          <w:iCs w:val="0"/>
+          <w:lang w:val="fr-CA"/>
+        </w:rPr>
+      </w:pPr>
+    </w:p>
+    <w:p>
+      <w:pPr>
+        <w:rPr>
+          <w:rStyle w:val="SubtleEmphasis"/>
+          <w:i w:val="0"/>
+          <w:iCs w:val="0"/>
+          <w:lang w:val="fr-CA"/>
+        </w:rPr>
+      </w:pPr>
+    </w:p>
+    <w:p>
+      <w:pPr>
+        <w:rPr>
+          <w:rStyle w:val="SubtleEmphasis"/>
+          <w:i w:val="0"/>
+          <w:iCs w:val="0"/>
+          <w:lang w:val="fr-CA"/>
+        </w:rPr>
+      </w:pPr>
+    </w:p>
+    <w:p>
+      <w:pPr>
+        <w:rPr>
+          <w:rStyle w:val="SubtleEmphasis"/>
+          <w:i w:val="0"/>
+          <w:iCs w:val="0"/>
+          <w:lang w:val="fr-CA"/>
+        </w:rPr>
+      </w:pPr>
+    </w:p>
+    <w:p>
+      <w:pPr>
+        <w:rPr>
+          <w:rStyle w:val="SubtleEmphasis"/>
+          <w:i w:val="0"/>
+          <w:iCs w:val="0"/>
+          <w:lang w:val="fr-CA"/>
+        </w:rPr>
+      </w:pPr>
+    </w:p>
+    <w:p>
+      <w:pPr>
+        <w:pStyle w:val="Subtitle"/>
+        <w:rPr>
+          <w:lang w:val="fr-CA"/>
+        </w:rPr>
+      </w:pPr>
+      <w:r>
+        <w:rPr>
+          <w:lang w:val="fr-CA"/>
+        </w:rPr>
+        <w:t xml:space="preserve">Partie </w:t>
+      </w:r>
+      <w:r>
+        <w:rPr>
+          <w:lang w:val="fr-CA"/>
+        </w:rPr>
+        <w:t>3</w:t>
+      </w:r>
+    </w:p>
+    <w:p>
+      <w:pPr>
+        <w:rPr>
+          <w:rStyle w:val="SubtleEmphasis"/>
+          <w:lang w:val="fr-CA"/>
+        </w:rPr>
+      </w:pPr>
+      <w:r>
+        <w:rPr>
+          <w:rStyle w:val="SubtleEmphasis"/>
+          <w:lang w:val="fr-CA"/>
+        </w:rPr>
         <w:t xml:space="preserve">Question 1: </w:t>
       </w:r>
     </w:p>
@@ -402,6 +851,7 @@
           <w:rStyle w:val="SubtleEmphasis"/>
           <w:lang w:val="fr-CA"/>
         </w:rPr>
+        <w:lastRenderedPageBreak/>
         <w:t xml:space="preserve">Question 2: </w:t>
       </w:r>
     </w:p>
@@ -440,7 +890,6 @@
           <w:iCs w:val="0"/>
           <w:lang w:val="fr-CA"/>
         </w:rPr>
-        <w:lastRenderedPageBreak/>
         <w:t>.</w:t>
       </w:r>
     </w:p>

</xml_diff>